<commit_message>
add the updates to monday
</commit_message>
<xml_diff>
--- a/lib/briefing/templates/CC.docx
+++ b/lib/briefing/templates/CC.docx
@@ -5893,6 +5893,524 @@
           <w:highlight w:val="yellow"/>
         </w:rPr>
         <w:t xml:space="preserve">+++END-FOR r+++</w:t>
+      </w:r>
+    </w:p>
+    <w:p>
+      <w:pPr>
+        <w:rPr>
+          <w:szCs w:val="18"/>
+          <w:highlight w:val="yellow"/>
+        </w:rPr>
+      </w:pPr>
+      <w:r>
+        <w:rPr>
+          <w:szCs w:val="18"/>
+          <w:highlight w:val="yellow"/>
+        </w:rPr>
+        <w:t xml:space="preserve">+++IF $blk.afbeelding+++</w:t>
+      </w:r>
+    </w:p>
+    <w:p>
+      <w:pPr>
+        <w:rPr>
+          <w:szCs w:val="18"/>
+          <w:highlight w:val="yellow"/>
+        </w:rPr>
+      </w:pPr>
+      <w:r>
+        <w:rPr>
+          <w:szCs w:val="18"/>
+          <w:highlight w:val="yellow"/>
+        </w:rPr>
+        <w:t xml:space="preserve">+++IMAGE blockImage($blk)+++</w:t>
+      </w:r>
+    </w:p>
+    <w:p>
+      <w:pPr>
+        <w:rPr>
+          <w:szCs w:val="18"/>
+          <w:highlight w:val="yellow"/>
+        </w:rPr>
+      </w:pPr>
+      <w:r>
+        <w:rPr>
+          <w:szCs w:val="18"/>
+          <w:highlight w:val="yellow"/>
+        </w:rPr>
+        <w:t xml:space="preserve">+++END-IF+++</w:t>
+      </w:r>
+    </w:p>
+    <w:p>
+      <w:pPr>
+        <w:rPr>
+          <w:szCs w:val="18"/>
+          <w:highlight w:val="yellow"/>
+        </w:rPr>
+      </w:pPr>
+      <w:r>
+        <w:rPr>
+          <w:szCs w:val="18"/>
+          <w:highlight w:val="yellow"/>
+        </w:rPr>
+        <w:t xml:space="preserve">+++IF $blk.historie+++</w:t>
+      </w:r>
+    </w:p>
+    <w:tbl>
+      <w:tblPr>
+        <w:tblW w:w="9060" w:type="dxa"/>
+        <w:tblBorders>
+          <w:top w:val="single" w:sz="4" w:color="BFBFBF"/>
+          <w:left w:val="single" w:sz="4" w:color="BFBFBF"/>
+          <w:bottom w:val="single" w:sz="4" w:color="BFBFBF"/>
+          <w:right w:val="single" w:sz="4" w:color="BFBFBF"/>
+          <w:insideH w:val="single" w:sz="4" w:color="BFBFBF"/>
+          <w:insideV w:val="single" w:sz="4" w:color="BFBFBF"/>
+        </w:tblBorders>
+      </w:tblPr>
+      <w:tblGrid>
+        <w:gridCol w:w="1812"/>
+        <w:gridCol w:w="1812"/>
+        <w:gridCol w:w="1812"/>
+        <w:gridCol w:w="1812"/>
+        <w:gridCol w:w="1812"/>
+      </w:tblGrid>
+      <w:tr>
+        <w:tc>
+          <w:tcPr>
+            <w:tcW w:w="1812" w:type="dxa"/>
+          </w:tcPr>
+          <w:p>
+            <w:pPr>
+              <w:rPr>
+                <w:szCs w:val="18"/>
+                <w:highlight w:val="yellow"/>
+              </w:rPr>
+            </w:pPr>
+            <w:r>
+              <w:rPr>
+                <w:szCs w:val="18"/>
+                <w:highlight w:val="yellow"/>
+              </w:rPr>
+              <w:t xml:space="preserve">Datum</w:t>
+            </w:r>
+          </w:p>
+        </w:tc>
+        <w:tc>
+          <w:tcPr>
+            <w:tcW w:w="1812" w:type="dxa"/>
+          </w:tcPr>
+          <w:p>
+            <w:pPr>
+              <w:rPr>
+                <w:szCs w:val="18"/>
+                <w:highlight w:val="yellow"/>
+              </w:rPr>
+            </w:pPr>
+            <w:r>
+              <w:rPr>
+                <w:szCs w:val="18"/>
+                <w:highlight w:val="yellow"/>
+              </w:rPr>
+              <w:t xml:space="preserve">Tijd</w:t>
+            </w:r>
+          </w:p>
+        </w:tc>
+        <w:tc>
+          <w:tcPr>
+            <w:tcW w:w="1812" w:type="dxa"/>
+          </w:tcPr>
+          <w:p>
+            <w:pPr>
+              <w:rPr>
+                <w:szCs w:val="18"/>
+                <w:highlight w:val="yellow"/>
+              </w:rPr>
+            </w:pPr>
+            <w:r>
+              <w:rPr>
+                <w:szCs w:val="18"/>
+                <w:highlight w:val="yellow"/>
+              </w:rPr>
+              <w:t xml:space="preserve">Klanttitel</w:t>
+            </w:r>
+          </w:p>
+        </w:tc>
+        <w:tc>
+          <w:tcPr>
+            <w:tcW w:w="1812" w:type="dxa"/>
+          </w:tcPr>
+          <w:p>
+            <w:pPr>
+              <w:rPr>
+                <w:szCs w:val="18"/>
+                <w:highlight w:val="yellow"/>
+              </w:rPr>
+            </w:pPr>
+            <w:r>
+              <w:rPr>
+                <w:szCs w:val="18"/>
+                <w:highlight w:val="yellow"/>
+              </w:rPr>
+              <w:t xml:space="preserve">Trainer (tel nr)</w:t>
+            </w:r>
+          </w:p>
+        </w:tc>
+        <w:tc>
+          <w:tcPr>
+            <w:tcW w:w="1812" w:type="dxa"/>
+          </w:tcPr>
+          <w:p>
+            <w:pPr>
+              <w:rPr>
+                <w:szCs w:val="18"/>
+                <w:highlight w:val="yellow"/>
+              </w:rPr>
+            </w:pPr>
+            <w:r>
+              <w:rPr>
+                <w:szCs w:val="18"/>
+                <w:highlight w:val="yellow"/>
+              </w:rPr>
+              <w:t xml:space="preserve">CP klant</w:t>
+            </w:r>
+          </w:p>
+        </w:tc>
+      </w:tr>
+      <w:tr>
+        <w:tc>
+          <w:tcPr>
+            <w:tcW w:w="1812" w:type="dxa"/>
+          </w:tcPr>
+          <w:p>
+            <w:pPr>
+              <w:rPr>
+                <w:szCs w:val="18"/>
+                <w:highlight w:val="yellow"/>
+              </w:rPr>
+            </w:pPr>
+            <w:r>
+              <w:rPr>
+                <w:szCs w:val="18"/>
+                <w:highlight w:val="yellow"/>
+              </w:rPr>
+              <w:t xml:space="preserve">+++FOR h IN $blk.historie+++</w:t>
+            </w:r>
+          </w:p>
+        </w:tc>
+        <w:tc>
+          <w:tcPr>
+            <w:tcW w:w="1812" w:type="dxa"/>
+          </w:tcPr>
+          <w:p>
+            <w:pPr>
+              <w:rPr>
+                <w:szCs w:val="18"/>
+                <w:highlight w:val="yellow"/>
+              </w:rPr>
+            </w:pPr>
+            <w:r>
+              <w:rPr>
+                <w:szCs w:val="18"/>
+                <w:highlight w:val="yellow"/>
+              </w:rPr>
+              <w:t xml:space="preserve"/>
+            </w:r>
+          </w:p>
+        </w:tc>
+        <w:tc>
+          <w:tcPr>
+            <w:tcW w:w="1812" w:type="dxa"/>
+          </w:tcPr>
+          <w:p>
+            <w:pPr>
+              <w:rPr>
+                <w:szCs w:val="18"/>
+                <w:highlight w:val="yellow"/>
+              </w:rPr>
+            </w:pPr>
+            <w:r>
+              <w:rPr>
+                <w:szCs w:val="18"/>
+                <w:highlight w:val="yellow"/>
+              </w:rPr>
+              <w:t xml:space="preserve"/>
+            </w:r>
+          </w:p>
+        </w:tc>
+        <w:tc>
+          <w:tcPr>
+            <w:tcW w:w="1812" w:type="dxa"/>
+          </w:tcPr>
+          <w:p>
+            <w:pPr>
+              <w:rPr>
+                <w:szCs w:val="18"/>
+                <w:highlight w:val="yellow"/>
+              </w:rPr>
+            </w:pPr>
+            <w:r>
+              <w:rPr>
+                <w:szCs w:val="18"/>
+                <w:highlight w:val="yellow"/>
+              </w:rPr>
+              <w:t xml:space="preserve"/>
+            </w:r>
+          </w:p>
+        </w:tc>
+        <w:tc>
+          <w:tcPr>
+            <w:tcW w:w="1812" w:type="dxa"/>
+          </w:tcPr>
+          <w:p>
+            <w:pPr>
+              <w:rPr>
+                <w:szCs w:val="18"/>
+                <w:highlight w:val="yellow"/>
+              </w:rPr>
+            </w:pPr>
+            <w:r>
+              <w:rPr>
+                <w:szCs w:val="18"/>
+                <w:highlight w:val="yellow"/>
+              </w:rPr>
+              <w:t xml:space="preserve"/>
+            </w:r>
+          </w:p>
+        </w:tc>
+      </w:tr>
+      <w:tr>
+        <w:tc>
+          <w:tcPr>
+            <w:tcW w:w="1812" w:type="dxa"/>
+          </w:tcPr>
+          <w:p>
+            <w:pPr>
+              <w:rPr>
+                <w:szCs w:val="18"/>
+                <w:highlight w:val="yellow"/>
+              </w:rPr>
+            </w:pPr>
+            <w:r>
+              <w:rPr>
+                <w:szCs w:val="18"/>
+                <w:highlight w:val="yellow"/>
+              </w:rPr>
+              <w:t xml:space="preserve">+++$h.datum+++</w:t>
+            </w:r>
+          </w:p>
+        </w:tc>
+        <w:tc>
+          <w:tcPr>
+            <w:tcW w:w="1812" w:type="dxa"/>
+          </w:tcPr>
+          <w:p>
+            <w:pPr>
+              <w:rPr>
+                <w:szCs w:val="18"/>
+                <w:highlight w:val="yellow"/>
+              </w:rPr>
+            </w:pPr>
+            <w:r>
+              <w:rPr>
+                <w:szCs w:val="18"/>
+                <w:highlight w:val="yellow"/>
+              </w:rPr>
+              <w:t xml:space="preserve">+++$h.tijd+++</w:t>
+            </w:r>
+          </w:p>
+        </w:tc>
+        <w:tc>
+          <w:tcPr>
+            <w:tcW w:w="1812" w:type="dxa"/>
+          </w:tcPr>
+          <w:p>
+            <w:pPr>
+              <w:rPr>
+                <w:szCs w:val="18"/>
+                <w:highlight w:val="yellow"/>
+              </w:rPr>
+            </w:pPr>
+            <w:r>
+              <w:rPr>
+                <w:szCs w:val="18"/>
+                <w:highlight w:val="yellow"/>
+              </w:rPr>
+              <w:t xml:space="preserve">+++$h.klanttitel+++</w:t>
+            </w:r>
+          </w:p>
+        </w:tc>
+        <w:tc>
+          <w:tcPr>
+            <w:tcW w:w="1812" w:type="dxa"/>
+          </w:tcPr>
+          <w:p>
+            <w:pPr>
+              <w:rPr>
+                <w:szCs w:val="18"/>
+                <w:highlight w:val="yellow"/>
+              </w:rPr>
+            </w:pPr>
+            <w:r>
+              <w:rPr>
+                <w:szCs w:val="18"/>
+                <w:highlight w:val="yellow"/>
+              </w:rPr>
+              <w:t xml:space="preserve">+++$h.trainer+++</w:t>
+            </w:r>
+          </w:p>
+        </w:tc>
+        <w:tc>
+          <w:tcPr>
+            <w:tcW w:w="1812" w:type="dxa"/>
+          </w:tcPr>
+          <w:p>
+            <w:pPr>
+              <w:rPr>
+                <w:szCs w:val="18"/>
+                <w:highlight w:val="yellow"/>
+              </w:rPr>
+            </w:pPr>
+            <w:r>
+              <w:rPr>
+                <w:szCs w:val="18"/>
+                <w:highlight w:val="yellow"/>
+              </w:rPr>
+              <w:t xml:space="preserve">+++$h.contactpersoon+++</w:t>
+            </w:r>
+          </w:p>
+        </w:tc>
+      </w:tr>
+      <w:tr>
+        <w:tc>
+          <w:tcPr>
+            <w:tcW w:w="1812" w:type="dxa"/>
+          </w:tcPr>
+          <w:p>
+            <w:pPr>
+              <w:rPr>
+                <w:szCs w:val="18"/>
+                <w:highlight w:val="yellow"/>
+              </w:rPr>
+            </w:pPr>
+            <w:r>
+              <w:rPr>
+                <w:szCs w:val="18"/>
+                <w:highlight w:val="yellow"/>
+              </w:rPr>
+              <w:t xml:space="preserve">+++END-FOR h+++</w:t>
+            </w:r>
+          </w:p>
+        </w:tc>
+        <w:tc>
+          <w:tcPr>
+            <w:tcW w:w="1812" w:type="dxa"/>
+          </w:tcPr>
+          <w:p>
+            <w:pPr>
+              <w:rPr>
+                <w:szCs w:val="18"/>
+                <w:highlight w:val="yellow"/>
+              </w:rPr>
+            </w:pPr>
+            <w:r>
+              <w:rPr>
+                <w:szCs w:val="18"/>
+                <w:highlight w:val="yellow"/>
+              </w:rPr>
+              <w:t xml:space="preserve"/>
+            </w:r>
+          </w:p>
+        </w:tc>
+        <w:tc>
+          <w:tcPr>
+            <w:tcW w:w="1812" w:type="dxa"/>
+          </w:tcPr>
+          <w:p>
+            <w:pPr>
+              <w:rPr>
+                <w:szCs w:val="18"/>
+                <w:highlight w:val="yellow"/>
+              </w:rPr>
+            </w:pPr>
+            <w:r>
+              <w:rPr>
+                <w:szCs w:val="18"/>
+                <w:highlight w:val="yellow"/>
+              </w:rPr>
+              <w:t xml:space="preserve"/>
+            </w:r>
+          </w:p>
+        </w:tc>
+        <w:tc>
+          <w:tcPr>
+            <w:tcW w:w="1812" w:type="dxa"/>
+          </w:tcPr>
+          <w:p>
+            <w:pPr>
+              <w:rPr>
+                <w:szCs w:val="18"/>
+                <w:highlight w:val="yellow"/>
+              </w:rPr>
+            </w:pPr>
+            <w:r>
+              <w:rPr>
+                <w:szCs w:val="18"/>
+                <w:highlight w:val="yellow"/>
+              </w:rPr>
+              <w:t xml:space="preserve"/>
+            </w:r>
+          </w:p>
+        </w:tc>
+        <w:tc>
+          <w:tcPr>
+            <w:tcW w:w="1812" w:type="dxa"/>
+          </w:tcPr>
+          <w:p>
+            <w:pPr>
+              <w:rPr>
+                <w:szCs w:val="18"/>
+                <w:highlight w:val="yellow"/>
+              </w:rPr>
+            </w:pPr>
+            <w:r>
+              <w:rPr>
+                <w:szCs w:val="18"/>
+                <w:highlight w:val="yellow"/>
+              </w:rPr>
+              <w:t xml:space="preserve"/>
+            </w:r>
+          </w:p>
+        </w:tc>
+      </w:tr>
+    </w:tbl>
+    <w:p>
+      <w:pPr>
+        <w:rPr>
+          <w:szCs w:val="18"/>
+          <w:highlight w:val="yellow"/>
+        </w:rPr>
+      </w:pPr>
+      <w:r>
+        <w:rPr>
+          <w:szCs w:val="18"/>
+          <w:highlight w:val="yellow"/>
+        </w:rPr>
+        <w:t xml:space="preserve"/>
+      </w:r>
+    </w:p>
+    <w:p>
+      <w:pPr>
+        <w:rPr>
+          <w:szCs w:val="18"/>
+          <w:highlight w:val="yellow"/>
+        </w:rPr>
+      </w:pPr>
+      <w:r>
+        <w:rPr>
+          <w:szCs w:val="18"/>
+          <w:highlight w:val="yellow"/>
+        </w:rPr>
+        <w:t xml:space="preserve">+++END-IF+++</w:t>
       </w:r>
     </w:p>
     <w:p>

</xml_diff>

<commit_message>
fix layout of doc
</commit_message>
<xml_diff>
--- a/lib/briefing/templates/CC.docx
+++ b/lib/briefing/templates/CC.docx
@@ -2924,13 +2924,6 @@
     <w:p>
       <w:pPr>
         <w:rPr>
-          <w:lang w:eastAsia="nl-NL"/>
-        </w:rPr>
-      </w:pPr>
-    </w:p>
-    <w:p>
-      <w:pPr>
-        <w:rPr>
           <w:szCs w:val="18"/>
         </w:rPr>
       </w:pPr>
@@ -2939,6 +2932,19 @@
           <w:szCs w:val="18"/>
         </w:rPr>
         <w:t xml:space="preserve">+++FOR blk IN rolblokken+++</w:t>
+      </w:r>
+    </w:p>
+    <w:p>
+      <w:pPr>
+        <w:rPr>
+          <w:szCs w:val="18"/>
+        </w:rPr>
+      </w:pPr>
+      <w:r>
+        <w:rPr>
+          <w:szCs w:val="18"/>
+        </w:rPr>
+        <w:t xml:space="preserve"/>
       </w:r>
     </w:p>
     <w:p>
@@ -3073,20 +3079,20 @@
         <w:rPr>
           <w:szCs w:val="18"/>
         </w:rPr>
+        <w:t xml:space="preserve">+++END-FOR blk+++</w:t>
+      </w:r>
+    </w:p>
+    <w:p>
+      <w:pPr>
+        <w:rPr>
+          <w:szCs w:val="18"/>
+        </w:rPr>
+      </w:pPr>
+      <w:r>
+        <w:rPr>
+          <w:szCs w:val="18"/>
+        </w:rPr>
         <w:t xml:space="preserve"/>
-      </w:r>
-    </w:p>
-    <w:p>
-      <w:pPr>
-        <w:rPr>
-          <w:szCs w:val="18"/>
-        </w:rPr>
-      </w:pPr>
-      <w:r>
-        <w:rPr>
-          <w:szCs w:val="18"/>
-        </w:rPr>
-        <w:t xml:space="preserve">+++END-FOR blk+++</w:t>
       </w:r>
     </w:p>
     <w:p>
@@ -3170,6 +3176,19 @@
           <w:szCs w:val="18"/>
         </w:rPr>
         <w:t xml:space="preserve">+++FOR blk IN blokken+++</w:t>
+      </w:r>
+    </w:p>
+    <w:p>
+      <w:pPr>
+        <w:rPr>
+          <w:szCs w:val="18"/>
+        </w:rPr>
+      </w:pPr>
+      <w:r>
+        <w:rPr>
+          <w:szCs w:val="18"/>
+        </w:rPr>
+        <w:t xml:space="preserve"/>
       </w:r>
     </w:p>
     <w:p>
@@ -3757,31 +3776,21 @@
         <w:rPr>
           <w:szCs w:val="18"/>
         </w:rPr>
+        <w:t xml:space="preserve">+++END-FOR blk+++</w:t>
+      </w:r>
+    </w:p>
+    <w:p>
+      <w:pPr>
+        <w:rPr>
+          <w:szCs w:val="18"/>
+        </w:rPr>
+      </w:pPr>
+      <w:r>
+        <w:rPr>
+          <w:szCs w:val="18"/>
+        </w:rPr>
         <w:t xml:space="preserve"/>
       </w:r>
-    </w:p>
-    <w:p>
-      <w:pPr>
-        <w:rPr>
-          <w:szCs w:val="18"/>
-        </w:rPr>
-      </w:pPr>
-      <w:r>
-        <w:rPr>
-          <w:szCs w:val="18"/>
-        </w:rPr>
-        <w:t xml:space="preserve">+++END-FOR blk+++</w:t>
-      </w:r>
-    </w:p>
-    <w:p>
-      <w:pPr>
-        <w:rPr/>
-      </w:pPr>
-    </w:p>
-    <w:p>
-      <w:pPr>
-        <w:rPr/>
-      </w:pPr>
     </w:p>
     <w:p>
       <w:pPr>

</xml_diff>

<commit_message>
fix layout of acteur seciton
</commit_message>
<xml_diff>
--- a/lib/briefing/templates/CC.docx
+++ b/lib/briefing/templates/CC.docx
@@ -2984,7 +2984,7 @@
         <w:rPr>
           <w:szCs w:val="18"/>
         </w:rPr>
-        <w:t xml:space="preserve">+++IF $r.bullet+++</w:t>
+        <w:t xml:space="preserve">+++IF $r.bullet &amp;&amp; !$r.niveau+++</w:t>
       </w:r>
     </w:p>
     <w:p>
@@ -3027,6 +3027,49 @@
         <w:rPr>
           <w:szCs w:val="18"/>
         </w:rPr>
+        <w:t xml:space="preserve">+++IF $r.bullet &amp;&amp; $r.niveau+++</w:t>
+      </w:r>
+    </w:p>
+    <w:p>
+      <w:pPr>
+        <w:numPr>
+          <w:ilvl w:val="1"/>
+          <w:numId w:val="1"/>
+        </w:numPr>
+        <w:rPr>
+          <w:szCs w:val="18"/>
+        </w:rPr>
+      </w:pPr>
+      <w:r>
+        <w:rPr>
+          <w:szCs w:val="18"/>
+        </w:rPr>
+        <w:t xml:space="preserve">+++$r.tekst+++</w:t>
+      </w:r>
+    </w:p>
+    <w:p>
+      <w:pPr>
+        <w:rPr>
+          <w:szCs w:val="18"/>
+        </w:rPr>
+      </w:pPr>
+      <w:r>
+        <w:rPr>
+          <w:szCs w:val="18"/>
+        </w:rPr>
+        <w:t xml:space="preserve">+++END-IF+++</w:t>
+      </w:r>
+    </w:p>
+    <w:p>
+      <w:pPr>
+        <w:rPr>
+          <w:szCs w:val="18"/>
+        </w:rPr>
+      </w:pPr>
+      <w:r>
+        <w:rPr>
+          <w:szCs w:val="18"/>
+        </w:rPr>
         <w:t xml:space="preserve">+++IF !$r.bullet+++</w:t>
       </w:r>
     </w:p>
@@ -3228,13 +3271,56 @@
         <w:rPr>
           <w:szCs w:val="18"/>
         </w:rPr>
-        <w:t xml:space="preserve">+++IF $r.bullet+++</w:t>
+        <w:t xml:space="preserve">+++IF $r.bullet &amp;&amp; !$r.niveau+++</w:t>
       </w:r>
     </w:p>
     <w:p>
       <w:pPr>
         <w:numPr>
           <w:ilvl w:val="0"/>
+          <w:numId w:val="1"/>
+        </w:numPr>
+        <w:rPr>
+          <w:szCs w:val="18"/>
+        </w:rPr>
+      </w:pPr>
+      <w:r>
+        <w:rPr>
+          <w:szCs w:val="18"/>
+        </w:rPr>
+        <w:t xml:space="preserve">+++$r.tekst+++</w:t>
+      </w:r>
+    </w:p>
+    <w:p>
+      <w:pPr>
+        <w:rPr>
+          <w:szCs w:val="18"/>
+        </w:rPr>
+      </w:pPr>
+      <w:r>
+        <w:rPr>
+          <w:szCs w:val="18"/>
+        </w:rPr>
+        <w:t xml:space="preserve">+++END-IF+++</w:t>
+      </w:r>
+    </w:p>
+    <w:p>
+      <w:pPr>
+        <w:rPr>
+          <w:szCs w:val="18"/>
+        </w:rPr>
+      </w:pPr>
+      <w:r>
+        <w:rPr>
+          <w:szCs w:val="18"/>
+        </w:rPr>
+        <w:t xml:space="preserve">+++IF $r.bullet &amp;&amp; $r.niveau+++</w:t>
+      </w:r>
+    </w:p>
+    <w:p>
+      <w:pPr>
+        <w:numPr>
+          <w:ilvl w:val="1"/>
           <w:numId w:val="1"/>
         </w:numPr>
         <w:rPr>

</xml_diff>